<commit_message>
add final literature review table in PDF and DOCX formats
</commit_message>
<xml_diff>
--- a/literatur/TABEL_PENELITIAN_TERDAHULU_FINAL.docx
+++ b/literatur/TABEL_PENELITIAN_TERDAHULU_FINAL.docx
@@ -469,7 +469,6 @@
         <w:t xml:space="preserve"> (State-of-the-Art)</w:t>
       </w:r>
     </w:p>
-    <w:p/>
     <w:p>
       <w:pPr>
         <w:jc w:val="center"/>
@@ -503,18 +502,19 @@
       <w:tblPr>
         <w:tblStyle w:val="TableGrid"/>
         <w:tblW w:w="5000" w:type="pct"/>
+        <w:tblLayout w:type="fixed"/>
         <w:tblLook w:val="04A0" w:firstRow="1" w:lastRow="0" w:firstColumn="1" w:lastColumn="0" w:noHBand="0" w:noVBand="1"/>
       </w:tblPr>
       <w:tblGrid>
-        <w:gridCol w:w="428"/>
-        <w:gridCol w:w="1112"/>
-        <w:gridCol w:w="2782"/>
-        <w:gridCol w:w="1131"/>
-        <w:gridCol w:w="1208"/>
-        <w:gridCol w:w="986"/>
-        <w:gridCol w:w="1554"/>
-        <w:gridCol w:w="1608"/>
-        <w:gridCol w:w="3807"/>
+        <w:gridCol w:w="427"/>
+        <w:gridCol w:w="1111"/>
+        <w:gridCol w:w="2540"/>
+        <w:gridCol w:w="1374"/>
+        <w:gridCol w:w="1318"/>
+        <w:gridCol w:w="1134"/>
+        <w:gridCol w:w="1558"/>
+        <w:gridCol w:w="2128"/>
+        <w:gridCol w:w="3026"/>
       </w:tblGrid>
       <w:tr>
         <w:tc>
@@ -557,7 +557,7 @@
         </w:tc>
         <w:tc>
           <w:tcPr>
-            <w:tcW w:w="952" w:type="pct"/>
+            <w:tcW w:w="869" w:type="pct"/>
           </w:tcPr>
           <w:p>
             <w:pPr>
@@ -576,7 +576,7 @@
         </w:tc>
         <w:tc>
           <w:tcPr>
-            <w:tcW w:w="387" w:type="pct"/>
+            <w:tcW w:w="470" w:type="pct"/>
           </w:tcPr>
           <w:p>
             <w:pPr>
@@ -595,7 +595,7 @@
         </w:tc>
         <w:tc>
           <w:tcPr>
-            <w:tcW w:w="413" w:type="pct"/>
+            <w:tcW w:w="451" w:type="pct"/>
           </w:tcPr>
           <w:p>
             <w:pPr>
@@ -614,7 +614,7 @@
         </w:tc>
         <w:tc>
           <w:tcPr>
-            <w:tcW w:w="337" w:type="pct"/>
+            <w:tcW w:w="388" w:type="pct"/>
           </w:tcPr>
           <w:p>
             <w:pPr>
@@ -633,7 +633,7 @@
         </w:tc>
         <w:tc>
           <w:tcPr>
-            <w:tcW w:w="532" w:type="pct"/>
+            <w:tcW w:w="533" w:type="pct"/>
           </w:tcPr>
           <w:p>
             <w:pPr>
@@ -652,7 +652,7 @@
         </w:tc>
         <w:tc>
           <w:tcPr>
-            <w:tcW w:w="550" w:type="pct"/>
+            <w:tcW w:w="728" w:type="pct"/>
           </w:tcPr>
           <w:p>
             <w:pPr>
@@ -671,7 +671,7 @@
         </w:tc>
         <w:tc>
           <w:tcPr>
-            <w:tcW w:w="1302" w:type="pct"/>
+            <w:tcW w:w="1035" w:type="pct"/>
           </w:tcPr>
           <w:p>
             <w:pPr>
@@ -728,7 +728,7 @@
         </w:tc>
         <w:tc>
           <w:tcPr>
-            <w:tcW w:w="952" w:type="pct"/>
+            <w:tcW w:w="869" w:type="pct"/>
           </w:tcPr>
           <w:p>
             <w:pPr>
@@ -746,14 +746,19 @@
               <w:rPr>
                 <w:rFonts w:ascii="Times New Roman" w:hAnsi="Times New Roman" w:cs="Times New Roman"/>
               </w:rPr>
-              <w:br/>
-              <w:t>— Discover Artificial Intelligence (Springer Nature), Vol. 4, Art. 79</w:t>
+              <w:t xml:space="preserve"> </w:t>
+            </w:r>
+            <w:r>
+              <w:rPr>
+                <w:rFonts w:ascii="Times New Roman" w:hAnsi="Times New Roman" w:cs="Times New Roman"/>
+              </w:rPr>
+              <w:t>Discover Artificial Intelligence (Springer Nature), Vol. 4, Art. 79</w:t>
             </w:r>
           </w:p>
         </w:tc>
         <w:tc>
           <w:tcPr>
-            <w:tcW w:w="387" w:type="pct"/>
+            <w:tcW w:w="470" w:type="pct"/>
           </w:tcPr>
           <w:p>
             <w:pPr>
@@ -771,7 +776,7 @@
         </w:tc>
         <w:tc>
           <w:tcPr>
-            <w:tcW w:w="413" w:type="pct"/>
+            <w:tcW w:w="451" w:type="pct"/>
           </w:tcPr>
           <w:p>
             <w:pPr>
@@ -789,7 +794,7 @@
         </w:tc>
         <w:tc>
           <w:tcPr>
-            <w:tcW w:w="337" w:type="pct"/>
+            <w:tcW w:w="388" w:type="pct"/>
           </w:tcPr>
           <w:p>
             <w:pPr>
@@ -807,7 +812,7 @@
         </w:tc>
         <w:tc>
           <w:tcPr>
-            <w:tcW w:w="532" w:type="pct"/>
+            <w:tcW w:w="533" w:type="pct"/>
           </w:tcPr>
           <w:p>
             <w:pPr>
@@ -825,7 +830,7 @@
         </w:tc>
         <w:tc>
           <w:tcPr>
-            <w:tcW w:w="550" w:type="pct"/>
+            <w:tcW w:w="728" w:type="pct"/>
           </w:tcPr>
           <w:p>
             <w:pPr>
@@ -844,19 +849,13 @@
                 <w:rFonts w:ascii="Times New Roman" w:hAnsi="Times New Roman" w:cs="Times New Roman"/>
               </w:rPr>
               <w:br/>
-            </w:r>
-            <w:r>
-              <w:rPr>
-                <w:rFonts w:ascii="Times New Roman" w:hAnsi="Times New Roman" w:cs="Times New Roman"/>
-              </w:rPr>
-              <w:lastRenderedPageBreak/>
               <w:t>-&gt; Posisi Skripsi: Menerapkan Borderline-SMOTE dan SHAP untuk interpretasi.</w:t>
             </w:r>
           </w:p>
         </w:tc>
         <w:tc>
           <w:tcPr>
-            <w:tcW w:w="1302" w:type="pct"/>
+            <w:tcW w:w="1035" w:type="pct"/>
           </w:tcPr>
           <w:p>
             <w:pPr>
@@ -864,13 +863,15 @@
                 <w:rFonts w:ascii="Times New Roman" w:hAnsi="Times New Roman" w:cs="Times New Roman"/>
               </w:rPr>
             </w:pPr>
-            <w:r>
-              <w:rPr>
-                <w:rFonts w:ascii="Times New Roman" w:hAnsi="Times New Roman" w:cs="Times New Roman"/>
-              </w:rPr>
-              <w:lastRenderedPageBreak/>
-              <w:t>https://doi.org/10.1007/s44163-023-00079-z</w:t>
-            </w:r>
+            <w:hyperlink r:id="rId6" w:history="1">
+              <w:r>
+                <w:rPr>
+                  <w:rStyle w:val="Hyperlink"/>
+                  <w:rFonts w:ascii="Times New Roman" w:hAnsi="Times New Roman" w:cs="Times New Roman"/>
+                </w:rPr>
+                <w:t>https://doi.org/10.1007/s44163-023-00079-z</w:t>
+              </w:r>
+            </w:hyperlink>
           </w:p>
         </w:tc>
       </w:tr>
@@ -907,13 +908,20 @@
               <w:rPr>
                 <w:rFonts w:ascii="Times New Roman" w:hAnsi="Times New Roman" w:cs="Times New Roman"/>
               </w:rPr>
-              <w:t>Panthakit &amp; Boonperm (2024)</w:t>
+              <w:t>Panthakit &amp; Boonper</w:t>
+            </w:r>
+            <w:r>
+              <w:rPr>
+                <w:rFonts w:ascii="Times New Roman" w:hAnsi="Times New Roman" w:cs="Times New Roman"/>
+              </w:rPr>
+              <w:lastRenderedPageBreak/>
+              <w:t>m (2024)</w:t>
             </w:r>
           </w:p>
         </w:tc>
         <w:tc>
           <w:tcPr>
-            <w:tcW w:w="952" w:type="pct"/>
+            <w:tcW w:w="869" w:type="pct"/>
           </w:tcPr>
           <w:p>
             <w:pPr>
@@ -925,20 +933,33 @@
               <w:rPr>
                 <w:rFonts w:ascii="Times New Roman" w:hAnsi="Times New Roman" w:cs="Times New Roman"/>
               </w:rPr>
+              <w:lastRenderedPageBreak/>
               <w:t>Student Dropout Prediction Using Machine Learning</w:t>
             </w:r>
             <w:r>
               <w:rPr>
                 <w:rFonts w:ascii="Times New Roman" w:hAnsi="Times New Roman" w:cs="Times New Roman"/>
               </w:rPr>
-              <w:br/>
-              <w:t>— 2024 9th International Conference on Business and Industrial Research (ICBIR), IEEE</w:t>
+              <w:t xml:space="preserve"> </w:t>
+            </w:r>
+            <w:r>
+              <w:rPr>
+                <w:rFonts w:ascii="Times New Roman" w:hAnsi="Times New Roman" w:cs="Times New Roman"/>
+              </w:rPr>
+              <w:t xml:space="preserve">2024 9th </w:t>
+            </w:r>
+            <w:r>
+              <w:rPr>
+                <w:rFonts w:ascii="Times New Roman" w:hAnsi="Times New Roman" w:cs="Times New Roman"/>
+              </w:rPr>
+              <w:lastRenderedPageBreak/>
+              <w:t>International Conference on Business and Industrial Research (ICBIR), IEEE</w:t>
             </w:r>
           </w:p>
         </w:tc>
         <w:tc>
           <w:tcPr>
-            <w:tcW w:w="387" w:type="pct"/>
+            <w:tcW w:w="470" w:type="pct"/>
           </w:tcPr>
           <w:p>
             <w:pPr>
@@ -950,6 +971,7 @@
               <w:rPr>
                 <w:rFonts w:ascii="Times New Roman" w:hAnsi="Times New Roman" w:cs="Times New Roman"/>
               </w:rPr>
+              <w:lastRenderedPageBreak/>
               <w:t>Dataset Mahasiswa Universitas</w:t>
             </w:r>
             <w:r>
@@ -957,13 +979,19 @@
                 <w:rFonts w:ascii="Times New Roman" w:hAnsi="Times New Roman" w:cs="Times New Roman"/>
               </w:rPr>
               <w:br/>
+            </w:r>
+            <w:r>
+              <w:rPr>
+                <w:rFonts w:ascii="Times New Roman" w:hAnsi="Times New Roman" w:cs="Times New Roman"/>
+              </w:rPr>
+              <w:lastRenderedPageBreak/>
               <w:t>2.000+ data</w:t>
             </w:r>
           </w:p>
         </w:tc>
         <w:tc>
           <w:tcPr>
-            <w:tcW w:w="413" w:type="pct"/>
+            <w:tcW w:w="451" w:type="pct"/>
           </w:tcPr>
           <w:p>
             <w:pPr>
@@ -975,13 +1003,21 @@
               <w:rPr>
                 <w:rFonts w:ascii="Times New Roman" w:hAnsi="Times New Roman" w:cs="Times New Roman"/>
               </w:rPr>
-              <w:t>Random Forest, XGBoost, Naive Bayes</w:t>
+              <w:lastRenderedPageBreak/>
+              <w:t xml:space="preserve">Random Forest, XGBoost, </w:t>
+            </w:r>
+            <w:r>
+              <w:rPr>
+                <w:rFonts w:ascii="Times New Roman" w:hAnsi="Times New Roman" w:cs="Times New Roman"/>
+              </w:rPr>
+              <w:lastRenderedPageBreak/>
+              <w:t>Naive Bayes</w:t>
             </w:r>
           </w:p>
         </w:tc>
         <w:tc>
           <w:tcPr>
-            <w:tcW w:w="337" w:type="pct"/>
+            <w:tcW w:w="388" w:type="pct"/>
           </w:tcPr>
           <w:p>
             <w:pPr>
@@ -993,13 +1029,14 @@
               <w:rPr>
                 <w:rFonts w:ascii="Times New Roman" w:hAnsi="Times New Roman" w:cs="Times New Roman"/>
               </w:rPr>
+              <w:lastRenderedPageBreak/>
               <w:t>Akurasi, F1-Score</w:t>
             </w:r>
           </w:p>
         </w:tc>
         <w:tc>
           <w:tcPr>
-            <w:tcW w:w="532" w:type="pct"/>
+            <w:tcW w:w="533" w:type="pct"/>
           </w:tcPr>
           <w:p>
             <w:pPr>
@@ -1011,13 +1048,20 @@
               <w:rPr>
                 <w:rFonts w:ascii="Times New Roman" w:hAnsi="Times New Roman" w:cs="Times New Roman"/>
               </w:rPr>
-              <w:t>Algoritma berbasis Tree mendominasi kemampuan deteksi dropout awal</w:t>
+              <w:t xml:space="preserve">Algoritma berbasis Tree mendominasi </w:t>
+            </w:r>
+            <w:r>
+              <w:rPr>
+                <w:rFonts w:ascii="Times New Roman" w:hAnsi="Times New Roman" w:cs="Times New Roman"/>
+              </w:rPr>
+              <w:lastRenderedPageBreak/>
+              <w:t>kemampuan deteksi dropout awal</w:t>
             </w:r>
           </w:p>
         </w:tc>
         <w:tc>
           <w:tcPr>
-            <w:tcW w:w="550" w:type="pct"/>
+            <w:tcW w:w="728" w:type="pct"/>
           </w:tcPr>
           <w:p>
             <w:pPr>
@@ -1029,26 +1073,46 @@
               <w:rPr>
                 <w:rFonts w:ascii="Times New Roman" w:hAnsi="Times New Roman" w:cs="Times New Roman"/>
               </w:rPr>
-              <w:t>Tidak menggunakan optimasi imbalance khusus. -&gt; Posisi Skripsi: Optimasi Borderline-SMOTE sebelum training XGBoost</w:t>
+              <w:lastRenderedPageBreak/>
+              <w:t xml:space="preserve">Tidak menggunakan optimasi imbalance khusus. -&gt; Posisi </w:t>
+            </w:r>
+            <w:r>
+              <w:rPr>
+                <w:rFonts w:ascii="Times New Roman" w:hAnsi="Times New Roman" w:cs="Times New Roman"/>
+              </w:rPr>
+              <w:lastRenderedPageBreak/>
+              <w:t>Skripsi: Optimasi Borderline-SMOTE sebelum training XGBoost</w:t>
             </w:r>
           </w:p>
         </w:tc>
         <w:tc>
           <w:tcPr>
-            <w:tcW w:w="1302" w:type="pct"/>
+            <w:tcW w:w="1035" w:type="pct"/>
           </w:tcPr>
           <w:p>
             <w:pPr>
               <w:rPr>
                 <w:rFonts w:ascii="Times New Roman" w:hAnsi="Times New Roman" w:cs="Times New Roman"/>
+                <w:lang w:val="en-ID"/>
               </w:rPr>
             </w:pPr>
-            <w:r>
-              <w:rPr>
-                <w:rFonts w:ascii="Times New Roman" w:hAnsi="Times New Roman" w:cs="Times New Roman"/>
-              </w:rPr>
-              <w:t>10.1109/icbir61386.2024.10875840</w:t>
-            </w:r>
+            <w:hyperlink r:id="rId7" w:history="1">
+              <w:r>
+                <w:rPr>
+                  <w:rStyle w:val="Hyperlink"/>
+                  <w:rFonts w:ascii="Times New Roman" w:hAnsi="Times New Roman" w:cs="Times New Roman"/>
+                  <w:lang w:val="en-ID"/>
+                </w:rPr>
+                <w:t>https://doi.org/10.1109/icbir61386.2024.10875840</w:t>
+              </w:r>
+            </w:hyperlink>
+          </w:p>
+          <w:p>
+            <w:pPr>
+              <w:rPr>
+                <w:rFonts w:ascii="Times New Roman" w:hAnsi="Times New Roman" w:cs="Times New Roman"/>
+              </w:rPr>
+            </w:pPr>
           </w:p>
         </w:tc>
       </w:tr>
@@ -1091,7 +1155,7 @@
         </w:tc>
         <w:tc>
           <w:tcPr>
-            <w:tcW w:w="952" w:type="pct"/>
+            <w:tcW w:w="869" w:type="pct"/>
           </w:tcPr>
           <w:p>
             <w:pPr>
@@ -1109,14 +1173,19 @@
               <w:rPr>
                 <w:rFonts w:ascii="Times New Roman" w:hAnsi="Times New Roman" w:cs="Times New Roman"/>
               </w:rPr>
-              <w:br/>
-              <w:t>— Discover Artificial Intelligence (Springer Nature), Vol. 6, Art. 1016</w:t>
+              <w:t xml:space="preserve"> </w:t>
+            </w:r>
+            <w:r>
+              <w:rPr>
+                <w:rFonts w:ascii="Times New Roman" w:hAnsi="Times New Roman" w:cs="Times New Roman"/>
+              </w:rPr>
+              <w:t>Discover Artificial Intelligence (Springer Nature), Vol. 6, Art. 1016</w:t>
             </w:r>
           </w:p>
         </w:tc>
         <w:tc>
           <w:tcPr>
-            <w:tcW w:w="387" w:type="pct"/>
+            <w:tcW w:w="470" w:type="pct"/>
           </w:tcPr>
           <w:p>
             <w:pPr>
@@ -1134,7 +1203,7 @@
         </w:tc>
         <w:tc>
           <w:tcPr>
-            <w:tcW w:w="413" w:type="pct"/>
+            <w:tcW w:w="451" w:type="pct"/>
           </w:tcPr>
           <w:p>
             <w:pPr>
@@ -1152,7 +1221,7 @@
         </w:tc>
         <w:tc>
           <w:tcPr>
-            <w:tcW w:w="337" w:type="pct"/>
+            <w:tcW w:w="388" w:type="pct"/>
           </w:tcPr>
           <w:p>
             <w:pPr>
@@ -1170,7 +1239,7 @@
         </w:tc>
         <w:tc>
           <w:tcPr>
-            <w:tcW w:w="532" w:type="pct"/>
+            <w:tcW w:w="533" w:type="pct"/>
           </w:tcPr>
           <w:p>
             <w:pPr>
@@ -1188,7 +1257,7 @@
         </w:tc>
         <w:tc>
           <w:tcPr>
-            <w:tcW w:w="550" w:type="pct"/>
+            <w:tcW w:w="728" w:type="pct"/>
           </w:tcPr>
           <w:p>
             <w:pPr>
@@ -1207,20 +1276,13 @@
                 <w:rFonts w:ascii="Times New Roman" w:hAnsi="Times New Roman" w:cs="Times New Roman"/>
               </w:rPr>
               <w:br/>
-              <w:t xml:space="preserve">-&gt; Posisi </w:t>
-            </w:r>
-            <w:r>
-              <w:rPr>
-                <w:rFonts w:ascii="Times New Roman" w:hAnsi="Times New Roman" w:cs="Times New Roman"/>
-              </w:rPr>
-              <w:lastRenderedPageBreak/>
-              <w:t>Skripsi: Menggabungkan Borderline-SMOTE dengan visualisasi SHAP Waterfall individual.</w:t>
+              <w:t>-&gt; Posisi Skripsi: Menggabungkan Borderline-SMOTE dengan visualisasi SHAP Waterfall individual.</w:t>
             </w:r>
           </w:p>
         </w:tc>
         <w:tc>
           <w:tcPr>
-            <w:tcW w:w="1302" w:type="pct"/>
+            <w:tcW w:w="1035" w:type="pct"/>
           </w:tcPr>
           <w:p>
             <w:pPr>
@@ -1228,13 +1290,15 @@
                 <w:rFonts w:ascii="Times New Roman" w:hAnsi="Times New Roman" w:cs="Times New Roman"/>
               </w:rPr>
             </w:pPr>
-            <w:r>
-              <w:rPr>
-                <w:rFonts w:ascii="Times New Roman" w:hAnsi="Times New Roman" w:cs="Times New Roman"/>
-              </w:rPr>
-              <w:lastRenderedPageBreak/>
-              <w:t>https://doi.org/10.1007/s44163-026-01016-6</w:t>
-            </w:r>
+            <w:hyperlink r:id="rId8" w:history="1">
+              <w:r>
+                <w:rPr>
+                  <w:rStyle w:val="Hyperlink"/>
+                  <w:rFonts w:ascii="Times New Roman" w:hAnsi="Times New Roman" w:cs="Times New Roman"/>
+                </w:rPr>
+                <w:t>https://doi.org/10.1007/s44163-026-01016-6</w:t>
+              </w:r>
+            </w:hyperlink>
           </w:p>
         </w:tc>
       </w:tr>
@@ -1277,7 +1341,7 @@
         </w:tc>
         <w:tc>
           <w:tcPr>
-            <w:tcW w:w="952" w:type="pct"/>
+            <w:tcW w:w="869" w:type="pct"/>
           </w:tcPr>
           <w:p>
             <w:pPr>
@@ -1295,14 +1359,19 @@
               <w:rPr>
                 <w:rFonts w:ascii="Times New Roman" w:hAnsi="Times New Roman" w:cs="Times New Roman"/>
               </w:rPr>
-              <w:br/>
-              <w:t>— Algorithms (MDPI), Vol. 18, Iss. 10, Art. 662</w:t>
+              <w:t xml:space="preserve"> </w:t>
+            </w:r>
+            <w:r>
+              <w:rPr>
+                <w:rFonts w:ascii="Times New Roman" w:hAnsi="Times New Roman" w:cs="Times New Roman"/>
+              </w:rPr>
+              <w:t>Algorithms (MDPI), Vol. 18, Iss. 10, Art. 662</w:t>
             </w:r>
           </w:p>
         </w:tc>
         <w:tc>
           <w:tcPr>
-            <w:tcW w:w="387" w:type="pct"/>
+            <w:tcW w:w="470" w:type="pct"/>
           </w:tcPr>
           <w:p>
             <w:pPr>
@@ -1320,7 +1389,7 @@
         </w:tc>
         <w:tc>
           <w:tcPr>
-            <w:tcW w:w="413" w:type="pct"/>
+            <w:tcW w:w="451" w:type="pct"/>
           </w:tcPr>
           <w:p>
             <w:pPr>
@@ -1338,7 +1407,7 @@
         </w:tc>
         <w:tc>
           <w:tcPr>
-            <w:tcW w:w="337" w:type="pct"/>
+            <w:tcW w:w="388" w:type="pct"/>
           </w:tcPr>
           <w:p>
             <w:pPr>
@@ -1356,7 +1425,7 @@
         </w:tc>
         <w:tc>
           <w:tcPr>
-            <w:tcW w:w="532" w:type="pct"/>
+            <w:tcW w:w="533" w:type="pct"/>
           </w:tcPr>
           <w:p>
             <w:pPr>
@@ -1374,7 +1443,7 @@
         </w:tc>
         <w:tc>
           <w:tcPr>
-            <w:tcW w:w="550" w:type="pct"/>
+            <w:tcW w:w="728" w:type="pct"/>
           </w:tcPr>
           <w:p>
             <w:pPr>
@@ -1393,13 +1462,20 @@
                 <w:rFonts w:ascii="Times New Roman" w:hAnsi="Times New Roman" w:cs="Times New Roman"/>
               </w:rPr>
               <w:br/>
-              <w:t>-&gt; Posisi Skripsi: Menyajikan komparasi mendalam CatBoost vs XGBoost pada atribut sosio-ekonomi kampus.</w:t>
+              <w:t xml:space="preserve">-&gt; Posisi Skripsi: Menyajikan komparasi mendalam CatBoost vs XGBoost pada </w:t>
+            </w:r>
+            <w:r>
+              <w:rPr>
+                <w:rFonts w:ascii="Times New Roman" w:hAnsi="Times New Roman" w:cs="Times New Roman"/>
+              </w:rPr>
+              <w:lastRenderedPageBreak/>
+              <w:t>atribut sosio-ekonomi kampus.</w:t>
             </w:r>
           </w:p>
         </w:tc>
         <w:tc>
           <w:tcPr>
-            <w:tcW w:w="1302" w:type="pct"/>
+            <w:tcW w:w="1035" w:type="pct"/>
           </w:tcPr>
           <w:p>
             <w:pPr>
@@ -1407,12 +1483,15 @@
                 <w:rFonts w:ascii="Times New Roman" w:hAnsi="Times New Roman" w:cs="Times New Roman"/>
               </w:rPr>
             </w:pPr>
-            <w:r>
-              <w:rPr>
-                <w:rFonts w:ascii="Times New Roman" w:hAnsi="Times New Roman" w:cs="Times New Roman"/>
-              </w:rPr>
-              <w:t>https://doi.org/10.3390/a18100662</w:t>
-            </w:r>
+            <w:hyperlink r:id="rId9" w:history="1">
+              <w:r>
+                <w:rPr>
+                  <w:rStyle w:val="Hyperlink"/>
+                  <w:rFonts w:ascii="Times New Roman" w:hAnsi="Times New Roman" w:cs="Times New Roman"/>
+                </w:rPr>
+                <w:t>https://doi.org/10.3390/a18100662</w:t>
+              </w:r>
+            </w:hyperlink>
           </w:p>
         </w:tc>
       </w:tr>
@@ -1455,7 +1534,7 @@
         </w:tc>
         <w:tc>
           <w:tcPr>
-            <w:tcW w:w="952" w:type="pct"/>
+            <w:tcW w:w="869" w:type="pct"/>
           </w:tcPr>
           <w:p>
             <w:pPr>
@@ -1473,20 +1552,27 @@
               <w:rPr>
                 <w:rFonts w:ascii="Times New Roman" w:hAnsi="Times New Roman" w:cs="Times New Roman"/>
               </w:rPr>
-              <w:br/>
-            </w:r>
-            <w:r>
-              <w:rPr>
-                <w:rFonts w:ascii="Times New Roman" w:hAnsi="Times New Roman" w:cs="Times New Roman"/>
-              </w:rPr>
-              <w:lastRenderedPageBreak/>
-              <w:t>— PeerJ Computer Science, Vol. 12, e3490</w:t>
+              <w:t xml:space="preserve"> </w:t>
+            </w:r>
+            <w:proofErr w:type="spellStart"/>
+            <w:r>
+              <w:rPr>
+                <w:rFonts w:ascii="Times New Roman" w:hAnsi="Times New Roman" w:cs="Times New Roman"/>
+              </w:rPr>
+              <w:t>PeerJ</w:t>
+            </w:r>
+            <w:proofErr w:type="spellEnd"/>
+            <w:r>
+              <w:rPr>
+                <w:rFonts w:ascii="Times New Roman" w:hAnsi="Times New Roman" w:cs="Times New Roman"/>
+              </w:rPr>
+              <w:t xml:space="preserve"> Computer Science, Vol. 12, e3490</w:t>
             </w:r>
           </w:p>
         </w:tc>
         <w:tc>
           <w:tcPr>
-            <w:tcW w:w="387" w:type="pct"/>
+            <w:tcW w:w="470" w:type="pct"/>
           </w:tcPr>
           <w:p>
             <w:pPr>
@@ -1498,21 +1584,13 @@
               <w:rPr>
                 <w:rFonts w:ascii="Times New Roman" w:hAnsi="Times New Roman" w:cs="Times New Roman"/>
               </w:rPr>
-              <w:lastRenderedPageBreak/>
-              <w:t>5.000+ data akademik mahasisw</w:t>
-            </w:r>
-            <w:r>
-              <w:rPr>
-                <w:rFonts w:ascii="Times New Roman" w:hAnsi="Times New Roman" w:cs="Times New Roman"/>
-              </w:rPr>
-              <w:lastRenderedPageBreak/>
-              <w:t>a perguruan tinggi</w:t>
+              <w:t>5.000+ data akademik mahasiswa perguruan tinggi</w:t>
             </w:r>
           </w:p>
         </w:tc>
         <w:tc>
           <w:tcPr>
-            <w:tcW w:w="413" w:type="pct"/>
+            <w:tcW w:w="451" w:type="pct"/>
           </w:tcPr>
           <w:p>
             <w:pPr>
@@ -1524,21 +1602,13 @@
               <w:rPr>
                 <w:rFonts w:ascii="Times New Roman" w:hAnsi="Times New Roman" w:cs="Times New Roman"/>
               </w:rPr>
-              <w:lastRenderedPageBreak/>
-              <w:t xml:space="preserve">Random Forest, Gradient Boosting, </w:t>
-            </w:r>
-            <w:r>
-              <w:rPr>
-                <w:rFonts w:ascii="Times New Roman" w:hAnsi="Times New Roman" w:cs="Times New Roman"/>
-              </w:rPr>
-              <w:lastRenderedPageBreak/>
-              <w:t>XGBoost + SHAP TreeExplainer</w:t>
+              <w:t>Random Forest, Gradient Boosting, XGBoost + SHAP TreeExplainer</w:t>
             </w:r>
           </w:p>
         </w:tc>
         <w:tc>
           <w:tcPr>
-            <w:tcW w:w="337" w:type="pct"/>
+            <w:tcW w:w="388" w:type="pct"/>
           </w:tcPr>
           <w:p>
             <w:pPr>
@@ -1550,21 +1620,13 @@
               <w:rPr>
                 <w:rFonts w:ascii="Times New Roman" w:hAnsi="Times New Roman" w:cs="Times New Roman"/>
               </w:rPr>
-              <w:lastRenderedPageBreak/>
-              <w:t xml:space="preserve">Accuracy, Recall, Macro </w:t>
-            </w:r>
-            <w:r>
-              <w:rPr>
-                <w:rFonts w:ascii="Times New Roman" w:hAnsi="Times New Roman" w:cs="Times New Roman"/>
-              </w:rPr>
-              <w:lastRenderedPageBreak/>
-              <w:t>F1, ROC-AUC</w:t>
+              <w:t>Accuracy, Recall, Macro F1, ROC-AUC</w:t>
             </w:r>
           </w:p>
         </w:tc>
         <w:tc>
           <w:tcPr>
-            <w:tcW w:w="532" w:type="pct"/>
+            <w:tcW w:w="533" w:type="pct"/>
           </w:tcPr>
           <w:p>
             <w:pPr>
@@ -1576,21 +1638,13 @@
               <w:rPr>
                 <w:rFonts w:ascii="Times New Roman" w:hAnsi="Times New Roman" w:cs="Times New Roman"/>
               </w:rPr>
-              <w:lastRenderedPageBreak/>
-              <w:t xml:space="preserve">Penggunaan SHAP membuktikan bahwa riwayat </w:t>
-            </w:r>
-            <w:r>
-              <w:rPr>
-                <w:rFonts w:ascii="Times New Roman" w:hAnsi="Times New Roman" w:cs="Times New Roman"/>
-              </w:rPr>
-              <w:lastRenderedPageBreak/>
-              <w:t>IPK semester pertama dan status beasiswa merupakan pembeda utama antara mahasiswa bertahan vs dropout.</w:t>
+              <w:t>Penggunaan SHAP membuktikan bahwa riwayat IPK semester pertama dan status beasiswa merupakan pembeda utama antara mahasiswa bertahan vs dropout.</w:t>
             </w:r>
           </w:p>
         </w:tc>
         <w:tc>
           <w:tcPr>
-            <w:tcW w:w="550" w:type="pct"/>
+            <w:tcW w:w="728" w:type="pct"/>
           </w:tcPr>
           <w:p>
             <w:pPr>
@@ -1602,15 +1656,7 @@
               <w:rPr>
                 <w:rFonts w:ascii="Times New Roman" w:hAnsi="Times New Roman" w:cs="Times New Roman"/>
               </w:rPr>
-              <w:lastRenderedPageBreak/>
-              <w:t xml:space="preserve">Penelitian tidak meneliti secara mendalam optimasi </w:t>
-            </w:r>
-            <w:r>
-              <w:rPr>
-                <w:rFonts w:ascii="Times New Roman" w:hAnsi="Times New Roman" w:cs="Times New Roman"/>
-              </w:rPr>
-              <w:lastRenderedPageBreak/>
-              <w:t>penanganan data tidak seimbang di tingkat data pre-processing (data-level resampling).</w:t>
+              <w:t>Penelitian tidak meneliti secara mendalam optimasi penanganan data tidak seimbang di tingkat data pre-processing (data-level resampling).</w:t>
             </w:r>
             <w:r>
               <w:rPr>
@@ -1623,7 +1669,7 @@
         </w:tc>
         <w:tc>
           <w:tcPr>
-            <w:tcW w:w="1302" w:type="pct"/>
+            <w:tcW w:w="1035" w:type="pct"/>
           </w:tcPr>
           <w:p>
             <w:pPr>
@@ -1631,13 +1677,22 @@
                 <w:rFonts w:ascii="Times New Roman" w:hAnsi="Times New Roman" w:cs="Times New Roman"/>
               </w:rPr>
             </w:pPr>
-            <w:r>
-              <w:rPr>
-                <w:rFonts w:ascii="Times New Roman" w:hAnsi="Times New Roman" w:cs="Times New Roman"/>
-              </w:rPr>
-              <w:lastRenderedPageBreak/>
-              <w:t>https://doi.org/10.7717/peerj-cs.3490</w:t>
-            </w:r>
+            <w:hyperlink r:id="rId10" w:history="1">
+              <w:r>
+                <w:rPr>
+                  <w:rStyle w:val="Hyperlink"/>
+                  <w:rFonts w:ascii="Times New Roman" w:hAnsi="Times New Roman" w:cs="Times New Roman"/>
+                </w:rPr>
+                <w:t>https://doi.org/10.7717/peerj-cs.349</w:t>
+              </w:r>
+              <w:r>
+                <w:rPr>
+                  <w:rStyle w:val="Hyperlink"/>
+                  <w:rFonts w:ascii="Times New Roman" w:hAnsi="Times New Roman" w:cs="Times New Roman"/>
+                </w:rPr>
+                <w:t>0</w:t>
+              </w:r>
+            </w:hyperlink>
           </w:p>
         </w:tc>
       </w:tr>
@@ -1680,7 +1735,7 @@
         </w:tc>
         <w:tc>
           <w:tcPr>
-            <w:tcW w:w="952" w:type="pct"/>
+            <w:tcW w:w="869" w:type="pct"/>
           </w:tcPr>
           <w:p>
             <w:pPr>
@@ -1698,14 +1753,19 @@
               <w:rPr>
                 <w:rFonts w:ascii="Times New Roman" w:hAnsi="Times New Roman" w:cs="Times New Roman"/>
               </w:rPr>
-              <w:br/>
-              <w:t>— IEEE ICTACS 2024 (IEEE Xplore), DOI: 10.1109/ictacs62700.2024.10840530</w:t>
+              <w:t xml:space="preserve"> </w:t>
+            </w:r>
+            <w:r>
+              <w:rPr>
+                <w:rFonts w:ascii="Times New Roman" w:hAnsi="Times New Roman" w:cs="Times New Roman"/>
+              </w:rPr>
+              <w:t>IEEE ICTACS 2024 (IEEE Xplore), DOI: 10.1109/ictacs62700.2024.10840530</w:t>
             </w:r>
           </w:p>
         </w:tc>
         <w:tc>
           <w:tcPr>
-            <w:tcW w:w="387" w:type="pct"/>
+            <w:tcW w:w="470" w:type="pct"/>
           </w:tcPr>
           <w:p>
             <w:pPr>
@@ -1723,7 +1783,7 @@
         </w:tc>
         <w:tc>
           <w:tcPr>
-            <w:tcW w:w="413" w:type="pct"/>
+            <w:tcW w:w="451" w:type="pct"/>
           </w:tcPr>
           <w:p>
             <w:pPr>
@@ -1741,7 +1801,7 @@
         </w:tc>
         <w:tc>
           <w:tcPr>
-            <w:tcW w:w="337" w:type="pct"/>
+            <w:tcW w:w="388" w:type="pct"/>
           </w:tcPr>
           <w:p>
             <w:pPr>
@@ -1759,7 +1819,7 @@
         </w:tc>
         <w:tc>
           <w:tcPr>
-            <w:tcW w:w="532" w:type="pct"/>
+            <w:tcW w:w="533" w:type="pct"/>
           </w:tcPr>
           <w:p>
             <w:pPr>
@@ -1777,7 +1837,7 @@
         </w:tc>
         <w:tc>
           <w:tcPr>
-            <w:tcW w:w="550" w:type="pct"/>
+            <w:tcW w:w="728" w:type="pct"/>
           </w:tcPr>
           <w:p>
             <w:pPr>
@@ -1796,20 +1856,13 @@
                 <w:rFonts w:ascii="Times New Roman" w:hAnsi="Times New Roman" w:cs="Times New Roman"/>
               </w:rPr>
               <w:br/>
-              <w:t xml:space="preserve">-&gt; Posisi Skripsi: Menghadirkan prototipe sistem peringatan dini (Streamlit) dengan kartu </w:t>
-            </w:r>
-            <w:r>
-              <w:rPr>
-                <w:rFonts w:ascii="Times New Roman" w:hAnsi="Times New Roman" w:cs="Times New Roman"/>
-              </w:rPr>
-              <w:lastRenderedPageBreak/>
-              <w:t>analisis SHAP individual.</w:t>
+              <w:t>-&gt; Posisi Skripsi: Menghadirkan prototipe sistem peringatan dini (Streamlit) dengan kartu analisis SHAP individual.</w:t>
             </w:r>
           </w:p>
         </w:tc>
         <w:tc>
           <w:tcPr>
-            <w:tcW w:w="1302" w:type="pct"/>
+            <w:tcW w:w="1035" w:type="pct"/>
           </w:tcPr>
           <w:p>
             <w:pPr>
@@ -1817,13 +1870,29 @@
                 <w:rFonts w:ascii="Times New Roman" w:hAnsi="Times New Roman" w:cs="Times New Roman"/>
               </w:rPr>
             </w:pPr>
-            <w:r>
-              <w:rPr>
-                <w:rFonts w:ascii="Times New Roman" w:hAnsi="Times New Roman" w:cs="Times New Roman"/>
-              </w:rPr>
-              <w:lastRenderedPageBreak/>
-              <w:t>https://doi.org/10.1109/ictacs62700.2024.10840530</w:t>
-            </w:r>
+            <w:hyperlink r:id="rId11" w:history="1">
+              <w:r>
+                <w:rPr>
+                  <w:rStyle w:val="Hyperlink"/>
+                  <w:rFonts w:ascii="Times New Roman" w:hAnsi="Times New Roman" w:cs="Times New Roman"/>
+                </w:rPr>
+                <w:t>ht</w:t>
+              </w:r>
+              <w:r>
+                <w:rPr>
+                  <w:rStyle w:val="Hyperlink"/>
+                  <w:rFonts w:ascii="Times New Roman" w:hAnsi="Times New Roman" w:cs="Times New Roman"/>
+                </w:rPr>
+                <w:t>t</w:t>
+              </w:r>
+              <w:r>
+                <w:rPr>
+                  <w:rStyle w:val="Hyperlink"/>
+                  <w:rFonts w:ascii="Times New Roman" w:hAnsi="Times New Roman" w:cs="Times New Roman"/>
+                </w:rPr>
+                <w:t>ps://doi.org/10.1109/ictacs62700.2024.10840530</w:t>
+              </w:r>
+            </w:hyperlink>
           </w:p>
         </w:tc>
       </w:tr>
@@ -1866,7 +1935,7 @@
         </w:tc>
         <w:tc>
           <w:tcPr>
-            <w:tcW w:w="952" w:type="pct"/>
+            <w:tcW w:w="869" w:type="pct"/>
           </w:tcPr>
           <w:p>
             <w:pPr>
@@ -1884,14 +1953,26 @@
               <w:rPr>
                 <w:rFonts w:ascii="Times New Roman" w:hAnsi="Times New Roman" w:cs="Times New Roman"/>
               </w:rPr>
-              <w:br/>
-              <w:t>— Computers in Human Behavior (Elsevier BV)</w:t>
+              <w:t xml:space="preserve"> </w:t>
+            </w:r>
+            <w:r>
+              <w:rPr>
+                <w:rFonts w:ascii="Times New Roman" w:hAnsi="Times New Roman" w:cs="Times New Roman"/>
+              </w:rPr>
+              <w:t xml:space="preserve">Computers in </w:t>
+            </w:r>
+            <w:r>
+              <w:rPr>
+                <w:rFonts w:ascii="Times New Roman" w:hAnsi="Times New Roman" w:cs="Times New Roman"/>
+              </w:rPr>
+              <w:lastRenderedPageBreak/>
+              <w:t>Human Behavior (Elsevier BV)</w:t>
             </w:r>
           </w:p>
         </w:tc>
         <w:tc>
           <w:tcPr>
-            <w:tcW w:w="387" w:type="pct"/>
+            <w:tcW w:w="470" w:type="pct"/>
           </w:tcPr>
           <w:p>
             <w:pPr>
@@ -1903,13 +1984,14 @@
               <w:rPr>
                 <w:rFonts w:ascii="Times New Roman" w:hAnsi="Times New Roman" w:cs="Times New Roman"/>
               </w:rPr>
+              <w:lastRenderedPageBreak/>
               <w:t>Data interaksi e-learning</w:t>
             </w:r>
           </w:p>
         </w:tc>
         <w:tc>
           <w:tcPr>
-            <w:tcW w:w="413" w:type="pct"/>
+            <w:tcW w:w="451" w:type="pct"/>
           </w:tcPr>
           <w:p>
             <w:pPr>
@@ -1927,7 +2009,7 @@
         </w:tc>
         <w:tc>
           <w:tcPr>
-            <w:tcW w:w="337" w:type="pct"/>
+            <w:tcW w:w="388" w:type="pct"/>
           </w:tcPr>
           <w:p>
             <w:pPr>
@@ -1945,7 +2027,7 @@
         </w:tc>
         <w:tc>
           <w:tcPr>
-            <w:tcW w:w="532" w:type="pct"/>
+            <w:tcW w:w="533" w:type="pct"/>
           </w:tcPr>
           <w:p>
             <w:pPr>
@@ -1957,13 +2039,20 @@
               <w:rPr>
                 <w:rFonts w:ascii="Times New Roman" w:hAnsi="Times New Roman" w:cs="Times New Roman"/>
               </w:rPr>
-              <w:t>Implementasi prediktor dropout sukses meningkatkan retensi di manajemen kampus</w:t>
+              <w:t xml:space="preserve">Implementasi prediktor dropout sukses meningkatkan retensi di </w:t>
+            </w:r>
+            <w:r>
+              <w:rPr>
+                <w:rFonts w:ascii="Times New Roman" w:hAnsi="Times New Roman" w:cs="Times New Roman"/>
+              </w:rPr>
+              <w:lastRenderedPageBreak/>
+              <w:t>manajemen kampus</w:t>
             </w:r>
           </w:p>
         </w:tc>
         <w:tc>
           <w:tcPr>
-            <w:tcW w:w="550" w:type="pct"/>
+            <w:tcW w:w="728" w:type="pct"/>
           </w:tcPr>
           <w:p>
             <w:pPr>
@@ -1975,13 +2064,21 @@
               <w:rPr>
                 <w:rFonts w:ascii="Times New Roman" w:hAnsi="Times New Roman" w:cs="Times New Roman"/>
               </w:rPr>
-              <w:t>Fokus pada aktivitas interaksi (log) daring. -&gt; Posisi Skripsi: Fokus pada dataset sosio-ekonomi dan demografis dari rekaman awal registrasi.</w:t>
+              <w:lastRenderedPageBreak/>
+              <w:t>Fokus pada aktivitas interaksi (log) daring. -&gt; Posisi Skripsi: Fokus pada dataset sosio-</w:t>
+            </w:r>
+            <w:r>
+              <w:rPr>
+                <w:rFonts w:ascii="Times New Roman" w:hAnsi="Times New Roman" w:cs="Times New Roman"/>
+              </w:rPr>
+              <w:lastRenderedPageBreak/>
+              <w:t>ekonomi dan demografis dari rekaman awal registrasi.</w:t>
             </w:r>
           </w:p>
         </w:tc>
         <w:tc>
           <w:tcPr>
-            <w:tcW w:w="1302" w:type="pct"/>
+            <w:tcW w:w="1035" w:type="pct"/>
           </w:tcPr>
           <w:p>
             <w:pPr>
@@ -1989,12 +2086,15 @@
                 <w:rFonts w:ascii="Times New Roman" w:hAnsi="Times New Roman" w:cs="Times New Roman"/>
               </w:rPr>
             </w:pPr>
-            <w:r>
-              <w:rPr>
-                <w:rFonts w:ascii="Times New Roman" w:hAnsi="Times New Roman" w:cs="Times New Roman"/>
-              </w:rPr>
-              <w:t>10.1016/j.chb.2024.108301</w:t>
-            </w:r>
+            <w:hyperlink r:id="rId12" w:history="1">
+              <w:r>
+                <w:rPr>
+                  <w:rStyle w:val="Hyperlink"/>
+                  <w:rFonts w:ascii="Times New Roman" w:hAnsi="Times New Roman" w:cs="Times New Roman"/>
+                </w:rPr>
+                <w:t>https://doi.org/10.1016/j.chb.2024.108301</w:t>
+              </w:r>
+            </w:hyperlink>
           </w:p>
         </w:tc>
       </w:tr>
@@ -2037,7 +2137,7 @@
         </w:tc>
         <w:tc>
           <w:tcPr>
-            <w:tcW w:w="952" w:type="pct"/>
+            <w:tcW w:w="869" w:type="pct"/>
           </w:tcPr>
           <w:p>
             <w:pPr>
@@ -2055,14 +2155,19 @@
               <w:rPr>
                 <w:rFonts w:ascii="Times New Roman" w:hAnsi="Times New Roman" w:cs="Times New Roman"/>
               </w:rPr>
-              <w:br/>
-              <w:t>— Arabian Journal for Science and Engineering (Springer Nature)</w:t>
+              <w:t xml:space="preserve"> </w:t>
+            </w:r>
+            <w:r>
+              <w:rPr>
+                <w:rFonts w:ascii="Times New Roman" w:hAnsi="Times New Roman" w:cs="Times New Roman"/>
+              </w:rPr>
+              <w:t>Arabian Journal for Science and Engineering (Springer Nature)</w:t>
             </w:r>
           </w:p>
         </w:tc>
         <w:tc>
           <w:tcPr>
-            <w:tcW w:w="387" w:type="pct"/>
+            <w:tcW w:w="470" w:type="pct"/>
           </w:tcPr>
           <w:p>
             <w:pPr>
@@ -2080,7 +2185,7 @@
         </w:tc>
         <w:tc>
           <w:tcPr>
-            <w:tcW w:w="413" w:type="pct"/>
+            <w:tcW w:w="451" w:type="pct"/>
           </w:tcPr>
           <w:p>
             <w:pPr>
@@ -2098,7 +2203,7 @@
         </w:tc>
         <w:tc>
           <w:tcPr>
-            <w:tcW w:w="337" w:type="pct"/>
+            <w:tcW w:w="388" w:type="pct"/>
           </w:tcPr>
           <w:p>
             <w:pPr>
@@ -2116,7 +2221,7 @@
         </w:tc>
         <w:tc>
           <w:tcPr>
-            <w:tcW w:w="532" w:type="pct"/>
+            <w:tcW w:w="533" w:type="pct"/>
           </w:tcPr>
           <w:p>
             <w:pPr>
@@ -2134,7 +2239,7 @@
         </w:tc>
         <w:tc>
           <w:tcPr>
-            <w:tcW w:w="550" w:type="pct"/>
+            <w:tcW w:w="728" w:type="pct"/>
           </w:tcPr>
           <w:p>
             <w:pPr>
@@ -2159,7 +2264,7 @@
         </w:tc>
         <w:tc>
           <w:tcPr>
-            <w:tcW w:w="1302" w:type="pct"/>
+            <w:tcW w:w="1035" w:type="pct"/>
           </w:tcPr>
           <w:p>
             <w:pPr>
@@ -2167,12 +2272,29 @@
                 <w:rFonts w:ascii="Times New Roman" w:hAnsi="Times New Roman" w:cs="Times New Roman"/>
               </w:rPr>
             </w:pPr>
-            <w:r>
-              <w:rPr>
-                <w:rFonts w:ascii="Times New Roman" w:hAnsi="Times New Roman" w:cs="Times New Roman"/>
-              </w:rPr>
-              <w:t>https://doi.org/10.1007/s13369-024-09287-w</w:t>
-            </w:r>
+            <w:hyperlink r:id="rId13" w:history="1">
+              <w:r>
+                <w:rPr>
+                  <w:rStyle w:val="Hyperlink"/>
+                  <w:rFonts w:ascii="Times New Roman" w:hAnsi="Times New Roman" w:cs="Times New Roman"/>
+                </w:rPr>
+                <w:t>https://doi.org/10.1007/s13369-024-</w:t>
+              </w:r>
+              <w:r>
+                <w:rPr>
+                  <w:rStyle w:val="Hyperlink"/>
+                  <w:rFonts w:ascii="Times New Roman" w:hAnsi="Times New Roman" w:cs="Times New Roman"/>
+                </w:rPr>
+                <w:t>0</w:t>
+              </w:r>
+              <w:r>
+                <w:rPr>
+                  <w:rStyle w:val="Hyperlink"/>
+                  <w:rFonts w:ascii="Times New Roman" w:hAnsi="Times New Roman" w:cs="Times New Roman"/>
+                </w:rPr>
+                <w:t>9287-w</w:t>
+              </w:r>
+            </w:hyperlink>
           </w:p>
         </w:tc>
       </w:tr>
@@ -2215,7 +2337,7 @@
         </w:tc>
         <w:tc>
           <w:tcPr>
-            <w:tcW w:w="952" w:type="pct"/>
+            <w:tcW w:w="869" w:type="pct"/>
           </w:tcPr>
           <w:p>
             <w:pPr>
@@ -2227,27 +2349,25 @@
               <w:rPr>
                 <w:rFonts w:ascii="Times New Roman" w:hAnsi="Times New Roman" w:cs="Times New Roman"/>
               </w:rPr>
-              <w:t xml:space="preserve">Predicting Academic Success of College Students </w:t>
-            </w:r>
-            <w:r>
-              <w:rPr>
-                <w:rFonts w:ascii="Times New Roman" w:hAnsi="Times New Roman" w:cs="Times New Roman"/>
-              </w:rPr>
-              <w:lastRenderedPageBreak/>
-              <w:t>Using Machine Learning Techniques</w:t>
-            </w:r>
-            <w:r>
-              <w:rPr>
-                <w:rFonts w:ascii="Times New Roman" w:hAnsi="Times New Roman" w:cs="Times New Roman"/>
-              </w:rPr>
-              <w:br/>
-              <w:t>— Data (MDPI)</w:t>
+              <w:t>Predicting Academic Success of College Students Using Machine Learning Techniques</w:t>
+            </w:r>
+            <w:r>
+              <w:rPr>
+                <w:rFonts w:ascii="Times New Roman" w:hAnsi="Times New Roman" w:cs="Times New Roman"/>
+              </w:rPr>
+              <w:t xml:space="preserve"> </w:t>
+            </w:r>
+            <w:r>
+              <w:rPr>
+                <w:rFonts w:ascii="Times New Roman" w:hAnsi="Times New Roman" w:cs="Times New Roman"/>
+              </w:rPr>
+              <w:t>Data (MDPI)</w:t>
             </w:r>
           </w:p>
         </w:tc>
         <w:tc>
           <w:tcPr>
-            <w:tcW w:w="387" w:type="pct"/>
+            <w:tcW w:w="470" w:type="pct"/>
           </w:tcPr>
           <w:p>
             <w:pPr>
@@ -2259,21 +2379,13 @@
               <w:rPr>
                 <w:rFonts w:ascii="Times New Roman" w:hAnsi="Times New Roman" w:cs="Times New Roman"/>
               </w:rPr>
-              <w:lastRenderedPageBreak/>
-              <w:t>Dataset Mahasisw</w:t>
-            </w:r>
-            <w:r>
-              <w:rPr>
-                <w:rFonts w:ascii="Times New Roman" w:hAnsi="Times New Roman" w:cs="Times New Roman"/>
-              </w:rPr>
-              <w:lastRenderedPageBreak/>
-              <w:t>a Kolej</w:t>
+              <w:t>Dataset Mahasiswa Kolej</w:t>
             </w:r>
           </w:p>
         </w:tc>
         <w:tc>
           <w:tcPr>
-            <w:tcW w:w="413" w:type="pct"/>
+            <w:tcW w:w="451" w:type="pct"/>
           </w:tcPr>
           <w:p>
             <w:pPr>
@@ -2285,14 +2397,13 @@
               <w:rPr>
                 <w:rFonts w:ascii="Times New Roman" w:hAnsi="Times New Roman" w:cs="Times New Roman"/>
               </w:rPr>
-              <w:lastRenderedPageBreak/>
               <w:t>XGBoost, SVM</w:t>
             </w:r>
           </w:p>
         </w:tc>
         <w:tc>
           <w:tcPr>
-            <w:tcW w:w="337" w:type="pct"/>
+            <w:tcW w:w="388" w:type="pct"/>
           </w:tcPr>
           <w:p>
             <w:pPr>
@@ -2304,20 +2415,13 @@
               <w:rPr>
                 <w:rFonts w:ascii="Times New Roman" w:hAnsi="Times New Roman" w:cs="Times New Roman"/>
               </w:rPr>
-              <w:t xml:space="preserve">F1-Score, </w:t>
-            </w:r>
-            <w:r>
-              <w:rPr>
-                <w:rFonts w:ascii="Times New Roman" w:hAnsi="Times New Roman" w:cs="Times New Roman"/>
-              </w:rPr>
-              <w:lastRenderedPageBreak/>
-              <w:t>Recall</w:t>
+              <w:t>F1-Score, Recall</w:t>
             </w:r>
           </w:p>
         </w:tc>
         <w:tc>
           <w:tcPr>
-            <w:tcW w:w="532" w:type="pct"/>
+            <w:tcW w:w="533" w:type="pct"/>
           </w:tcPr>
           <w:p>
             <w:pPr>
@@ -2329,21 +2433,13 @@
               <w:rPr>
                 <w:rFonts w:ascii="Times New Roman" w:hAnsi="Times New Roman" w:cs="Times New Roman"/>
               </w:rPr>
-              <w:lastRenderedPageBreak/>
-              <w:t xml:space="preserve">XGBoost memberikan </w:t>
-            </w:r>
-            <w:r>
-              <w:rPr>
-                <w:rFonts w:ascii="Times New Roman" w:hAnsi="Times New Roman" w:cs="Times New Roman"/>
-              </w:rPr>
-              <w:lastRenderedPageBreak/>
-              <w:t>hasil sangat kuat dibanding SVM pada klasifikasi kelas tidak seimbang</w:t>
+              <w:t>XGBoost memberikan hasil sangat kuat dibanding SVM pada klasifikasi kelas tidak seimbang</w:t>
             </w:r>
           </w:p>
         </w:tc>
         <w:tc>
           <w:tcPr>
-            <w:tcW w:w="550" w:type="pct"/>
+            <w:tcW w:w="728" w:type="pct"/>
           </w:tcPr>
           <w:p>
             <w:pPr>
@@ -2355,21 +2451,13 @@
               <w:rPr>
                 <w:rFonts w:ascii="Times New Roman" w:hAnsi="Times New Roman" w:cs="Times New Roman"/>
               </w:rPr>
-              <w:lastRenderedPageBreak/>
-              <w:t>Belum memaksimalka</w:t>
-            </w:r>
-            <w:r>
-              <w:rPr>
-                <w:rFonts w:ascii="Times New Roman" w:hAnsi="Times New Roman" w:cs="Times New Roman"/>
-              </w:rPr>
-              <w:lastRenderedPageBreak/>
-              <w:t>n sampling metode khusus (Borderline-SMOTE). -&gt; Posisi Skripsi: Komparasi langsung XGBoost dan CatBoost dengan Borderline-SMOTE.</w:t>
+              <w:t>Belum memaksimalkan sampling metode khusus (Borderline-SMOTE). -&gt; Posisi Skripsi: Komparasi langsung XGBoost dan CatBoost dengan Borderline-SMOTE.</w:t>
             </w:r>
           </w:p>
         </w:tc>
         <w:tc>
           <w:tcPr>
-            <w:tcW w:w="1302" w:type="pct"/>
+            <w:tcW w:w="1035" w:type="pct"/>
           </w:tcPr>
           <w:p>
             <w:pPr>
@@ -2377,13 +2465,15 @@
                 <w:rFonts w:ascii="Times New Roman" w:hAnsi="Times New Roman" w:cs="Times New Roman"/>
               </w:rPr>
             </w:pPr>
-            <w:r>
-              <w:rPr>
-                <w:rFonts w:ascii="Times New Roman" w:hAnsi="Times New Roman" w:cs="Times New Roman"/>
-              </w:rPr>
-              <w:lastRenderedPageBreak/>
-              <w:t>10.3390/data9040060</w:t>
-            </w:r>
+            <w:hyperlink r:id="rId14" w:history="1">
+              <w:r>
+                <w:rPr>
+                  <w:rStyle w:val="Hyperlink"/>
+                  <w:rFonts w:ascii="Times New Roman" w:hAnsi="Times New Roman" w:cs="Times New Roman"/>
+                </w:rPr>
+                <w:t>https://doi.org/10.3390/data9040060</w:t>
+              </w:r>
+            </w:hyperlink>
           </w:p>
         </w:tc>
       </w:tr>
@@ -2426,7 +2516,7 @@
         </w:tc>
         <w:tc>
           <w:tcPr>
-            <w:tcW w:w="952" w:type="pct"/>
+            <w:tcW w:w="869" w:type="pct"/>
           </w:tcPr>
           <w:p>
             <w:pPr>
@@ -2444,14 +2534,19 @@
               <w:rPr>
                 <w:rFonts w:ascii="Times New Roman" w:hAnsi="Times New Roman" w:cs="Times New Roman"/>
               </w:rPr>
-              <w:br/>
-              <w:t>— Scientific Reports (Nature Portfolio)</w:t>
+              <w:t xml:space="preserve"> </w:t>
+            </w:r>
+            <w:r>
+              <w:rPr>
+                <w:rFonts w:ascii="Times New Roman" w:hAnsi="Times New Roman" w:cs="Times New Roman"/>
+              </w:rPr>
+              <w:t>Scientific Reports (Nature Portfolio)</w:t>
             </w:r>
           </w:p>
         </w:tc>
         <w:tc>
           <w:tcPr>
-            <w:tcW w:w="387" w:type="pct"/>
+            <w:tcW w:w="470" w:type="pct"/>
           </w:tcPr>
           <w:p>
             <w:pPr>
@@ -2469,7 +2564,7 @@
         </w:tc>
         <w:tc>
           <w:tcPr>
-            <w:tcW w:w="413" w:type="pct"/>
+            <w:tcW w:w="451" w:type="pct"/>
           </w:tcPr>
           <w:p>
             <w:pPr>
@@ -2487,7 +2582,7 @@
         </w:tc>
         <w:tc>
           <w:tcPr>
-            <w:tcW w:w="337" w:type="pct"/>
+            <w:tcW w:w="388" w:type="pct"/>
           </w:tcPr>
           <w:p>
             <w:pPr>
@@ -2505,7 +2600,7 @@
         </w:tc>
         <w:tc>
           <w:tcPr>
-            <w:tcW w:w="532" w:type="pct"/>
+            <w:tcW w:w="533" w:type="pct"/>
           </w:tcPr>
           <w:p>
             <w:pPr>
@@ -2517,13 +2612,20 @@
               <w:rPr>
                 <w:rFonts w:ascii="Times New Roman" w:hAnsi="Times New Roman" w:cs="Times New Roman"/>
               </w:rPr>
-              <w:t>Kombinasi model Ensemble ML dan analisis SHAP/LIME memberikan presisi tinggi sekaligus penjelasan detail alasan mahasiswa berhasil/gagal.</w:t>
+              <w:t xml:space="preserve">Kombinasi model Ensemble ML dan analisis SHAP/LIME memberikan presisi tinggi sekaligus penjelasan detail alasan </w:t>
+            </w:r>
+            <w:r>
+              <w:rPr>
+                <w:rFonts w:ascii="Times New Roman" w:hAnsi="Times New Roman" w:cs="Times New Roman"/>
+              </w:rPr>
+              <w:lastRenderedPageBreak/>
+              <w:t>mahasiswa berhasil/gagal.</w:t>
             </w:r>
           </w:p>
         </w:tc>
         <w:tc>
           <w:tcPr>
-            <w:tcW w:w="550" w:type="pct"/>
+            <w:tcW w:w="728" w:type="pct"/>
           </w:tcPr>
           <w:p>
             <w:pPr>
@@ -2535,6 +2637,7 @@
               <w:rPr>
                 <w:rFonts w:ascii="Times New Roman" w:hAnsi="Times New Roman" w:cs="Times New Roman"/>
               </w:rPr>
+              <w:lastRenderedPageBreak/>
               <w:t>Fokus utama studi adalah data aktivitas klik LMS daring, bukan riwayat status sosio-ekonomi atau demografi pendaftaran awal (seperti pada dataset UCI 697).</w:t>
             </w:r>
             <w:r>
@@ -2542,13 +2645,20 @@
                 <w:rFonts w:ascii="Times New Roman" w:hAnsi="Times New Roman" w:cs="Times New Roman"/>
               </w:rPr>
               <w:br/>
-              <w:t>-&gt; Posisi Skripsi: Mengaplikasikan kerangka Ensemble + SHAP pada data sosio-ekonomi tabular murni.</w:t>
+              <w:t xml:space="preserve">-&gt; Posisi Skripsi: </w:t>
+            </w:r>
+            <w:r>
+              <w:rPr>
+                <w:rFonts w:ascii="Times New Roman" w:hAnsi="Times New Roman" w:cs="Times New Roman"/>
+              </w:rPr>
+              <w:lastRenderedPageBreak/>
+              <w:t>Mengaplikasikan kerangka Ensemble + SHAP pada data sosio-ekonomi tabular murni.</w:t>
             </w:r>
           </w:p>
         </w:tc>
         <w:tc>
           <w:tcPr>
-            <w:tcW w:w="1302" w:type="pct"/>
+            <w:tcW w:w="1035" w:type="pct"/>
           </w:tcPr>
           <w:p>
             <w:pPr>
@@ -2556,12 +2666,29 @@
                 <w:rFonts w:ascii="Times New Roman" w:hAnsi="Times New Roman" w:cs="Times New Roman"/>
               </w:rPr>
             </w:pPr>
-            <w:r>
-              <w:rPr>
-                <w:rFonts w:ascii="Times New Roman" w:hAnsi="Times New Roman" w:cs="Times New Roman"/>
-              </w:rPr>
-              <w:t>https://doi.org/10.1038/s41598-026-49894-1</w:t>
-            </w:r>
+            <w:hyperlink r:id="rId15" w:history="1">
+              <w:r>
+                <w:rPr>
+                  <w:rStyle w:val="Hyperlink"/>
+                  <w:rFonts w:ascii="Times New Roman" w:hAnsi="Times New Roman" w:cs="Times New Roman"/>
+                </w:rPr>
+                <w:t>https://doi.org/10.1038/s41598-026</w:t>
+              </w:r>
+              <w:r>
+                <w:rPr>
+                  <w:rStyle w:val="Hyperlink"/>
+                  <w:rFonts w:ascii="Times New Roman" w:hAnsi="Times New Roman" w:cs="Times New Roman"/>
+                </w:rPr>
+                <w:t>-</w:t>
+              </w:r>
+              <w:r>
+                <w:rPr>
+                  <w:rStyle w:val="Hyperlink"/>
+                  <w:rFonts w:ascii="Times New Roman" w:hAnsi="Times New Roman" w:cs="Times New Roman"/>
+                </w:rPr>
+                <w:t>49894-1</w:t>
+              </w:r>
+            </w:hyperlink>
           </w:p>
         </w:tc>
       </w:tr>
@@ -3389,7 +3516,6 @@
   <w:style w:type="character" w:default="1" w:styleId="DefaultParagraphFont">
     <w:name w:val="Default Paragraph Font"/>
     <w:uiPriority w:val="1"/>
-    <w:semiHidden/>
     <w:unhideWhenUsed/>
   </w:style>
   <w:style w:type="table" w:default="1" w:styleId="TableNormal">
@@ -14165,6 +14291,41 @@
         <w:shd w:val="clear" w:color="auto" w:fill="FBCAA2" w:themeFill="accent6" w:themeFillTint="7F"/>
       </w:tcPr>
     </w:tblStylePr>
+  </w:style>
+  <w:style w:type="character" w:styleId="Hyperlink">
+    <w:name w:val="Hyperlink"/>
+    <w:basedOn w:val="DefaultParagraphFont"/>
+    <w:uiPriority w:val="99"/>
+    <w:unhideWhenUsed/>
+    <w:rsid w:val="00237D73"/>
+    <w:rPr>
+      <w:color w:val="0000FF" w:themeColor="hyperlink"/>
+      <w:u w:val="single"/>
+    </w:rPr>
+  </w:style>
+  <w:style w:type="character" w:styleId="UnresolvedMention">
+    <w:name w:val="Unresolved Mention"/>
+    <w:basedOn w:val="DefaultParagraphFont"/>
+    <w:uiPriority w:val="99"/>
+    <w:semiHidden/>
+    <w:unhideWhenUsed/>
+    <w:rsid w:val="00237D73"/>
+    <w:rPr>
+      <w:color w:val="605E5C"/>
+      <w:shd w:val="clear" w:color="auto" w:fill="E1DFDD"/>
+    </w:rPr>
+  </w:style>
+  <w:style w:type="character" w:styleId="FollowedHyperlink">
+    <w:name w:val="FollowedHyperlink"/>
+    <w:basedOn w:val="DefaultParagraphFont"/>
+    <w:uiPriority w:val="99"/>
+    <w:semiHidden/>
+    <w:unhideWhenUsed/>
+    <w:rsid w:val="00237D73"/>
+    <w:rPr>
+      <w:color w:val="800080" w:themeColor="followedHyperlink"/>
+      <w:u w:val="single"/>
+    </w:rPr>
   </w:style>
 </w:styles>
 </file>

</xml_diff>